<commit_message>
docker - storage file updated
</commit_message>
<xml_diff>
--- a/Docker/5-storage.docx
+++ b/Docker/5-storage.docx
@@ -6928,15 +6928,7 @@
           <w:sz w:val="28"/>
           <w:szCs w:val="28"/>
         </w:rPr>
-        <w:t>Docker creates</w:t>
-      </w:r>
-      <w:r>
-        <w:rPr>
-          <w:rFonts w:asciiTheme="majorBidi" w:hAnsiTheme="majorBidi" w:cstheme="majorBidi"/>
-          <w:sz w:val="28"/>
-          <w:szCs w:val="28"/>
-        </w:rPr>
-        <w:t xml:space="preserve"> </w:t>
+        <w:t xml:space="preserve">Docker creates </w:t>
       </w:r>
       <w:r>
         <w:rPr>
@@ -7017,43 +7009,7 @@
           <w:szCs w:val="28"/>
           <w:u w:val="single"/>
         </w:rPr>
-        <w:t>C</w:t>
-      </w:r>
-      <w:r>
-        <w:rPr>
-          <w:rFonts w:asciiTheme="majorBidi" w:hAnsiTheme="majorBidi" w:cstheme="majorBidi"/>
-          <w:sz w:val="28"/>
-          <w:szCs w:val="28"/>
-          <w:u w:val="single"/>
-        </w:rPr>
-        <w:t>hange</w:t>
-      </w:r>
-      <w:r>
-        <w:rPr>
-          <w:rFonts w:asciiTheme="majorBidi" w:hAnsiTheme="majorBidi" w:cstheme="majorBidi"/>
-          <w:sz w:val="28"/>
-          <w:szCs w:val="28"/>
-          <w:u w:val="single"/>
-        </w:rPr>
-        <w:t xml:space="preserve"> the</w:t>
-      </w:r>
-      <w:r>
-        <w:rPr>
-          <w:rFonts w:asciiTheme="majorBidi" w:hAnsiTheme="majorBidi" w:cstheme="majorBidi"/>
-          <w:sz w:val="28"/>
-          <w:szCs w:val="28"/>
-          <w:u w:val="single"/>
-        </w:rPr>
-        <w:t xml:space="preserve"> Docker’s root directory</w:t>
-      </w:r>
-      <w:r>
-        <w:rPr>
-          <w:rFonts w:asciiTheme="majorBidi" w:hAnsiTheme="majorBidi" w:cstheme="majorBidi"/>
-          <w:sz w:val="28"/>
-          <w:szCs w:val="28"/>
-          <w:u w:val="single"/>
-        </w:rPr>
-        <w:t>:</w:t>
+        <w:t>Change the Docker’s root directory:</w:t>
       </w:r>
     </w:p>
     <w:p>
@@ -7522,25 +7478,7 @@
           <w:szCs w:val="28"/>
           <w:u w:val="single"/>
         </w:rPr>
-        <w:t>P</w:t>
-      </w:r>
-      <w:r>
-        <w:rPr>
-          <w:rFonts w:asciiTheme="majorBidi" w:hAnsiTheme="majorBidi" w:cstheme="majorBidi"/>
-          <w:sz w:val="28"/>
-          <w:szCs w:val="28"/>
-          <w:u w:val="single"/>
-        </w:rPr>
-        <w:t>ermissions</w:t>
-      </w:r>
-      <w:r>
-        <w:rPr>
-          <w:rFonts w:asciiTheme="majorBidi" w:hAnsiTheme="majorBidi" w:cstheme="majorBidi"/>
-          <w:sz w:val="28"/>
-          <w:szCs w:val="28"/>
-          <w:u w:val="single"/>
-        </w:rPr>
-        <w:t>:</w:t>
+        <w:t>Permissions:</w:t>
       </w:r>
     </w:p>
     <w:p>
@@ -7646,34 +7584,7 @@
           <w:szCs w:val="28"/>
           <w:u w:val="single"/>
         </w:rPr>
-        <w:t xml:space="preserve">Mount propagation </w:t>
-      </w:r>
-      <w:r>
-        <w:rPr>
-          <w:rFonts w:asciiTheme="majorBidi" w:hAnsiTheme="majorBidi" w:cstheme="majorBidi"/>
-          <w:sz w:val="28"/>
-          <w:szCs w:val="28"/>
-          <w:u w:val="single"/>
-        </w:rPr>
-        <w:t>&amp;</w:t>
-      </w:r>
-      <w:r>
-        <w:rPr>
-          <w:rFonts w:asciiTheme="majorBidi" w:hAnsiTheme="majorBidi" w:cstheme="majorBidi"/>
-          <w:sz w:val="28"/>
-          <w:szCs w:val="28"/>
-          <w:u w:val="single"/>
-        </w:rPr>
-        <w:t xml:space="preserve"> mount overlaying behavior</w:t>
-      </w:r>
-      <w:r>
-        <w:rPr>
-          <w:rFonts w:asciiTheme="majorBidi" w:hAnsiTheme="majorBidi" w:cstheme="majorBidi"/>
-          <w:sz w:val="28"/>
-          <w:szCs w:val="28"/>
-          <w:u w:val="single"/>
-        </w:rPr>
-        <w:t>:</w:t>
+        <w:t>Mount propagation &amp; mount overlaying behavior:</w:t>
       </w:r>
     </w:p>
     <w:p>
@@ -7805,15 +7716,7 @@
           <w:sz w:val="28"/>
           <w:szCs w:val="28"/>
         </w:rPr>
-        <w:t>You run:</w:t>
-      </w:r>
-      <w:r>
-        <w:rPr>
-          <w:rFonts w:asciiTheme="majorBidi" w:hAnsiTheme="majorBidi" w:cstheme="majorBidi"/>
-          <w:sz w:val="28"/>
-          <w:szCs w:val="28"/>
-        </w:rPr>
-        <w:t xml:space="preserve"> </w:t>
+        <w:t xml:space="preserve">You run: </w:t>
       </w:r>
     </w:p>
     <w:p>
@@ -7929,23 +7832,7 @@
           <w:sz w:val="28"/>
           <w:szCs w:val="28"/>
         </w:rPr>
-        <w:t xml:space="preserve"> into the volume.</w:t>
-      </w:r>
-      <w:r>
-        <w:rPr>
-          <w:rFonts w:asciiTheme="majorBidi" w:hAnsiTheme="majorBidi" w:cstheme="majorBidi"/>
-          <w:sz w:val="28"/>
-          <w:szCs w:val="28"/>
-        </w:rPr>
-        <w:t xml:space="preserve"> </w:t>
-      </w:r>
-      <w:r>
-        <w:rPr>
-          <w:rFonts w:asciiTheme="majorBidi" w:hAnsiTheme="majorBidi" w:cstheme="majorBidi"/>
-          <w:sz w:val="28"/>
-          <w:szCs w:val="28"/>
-        </w:rPr>
-        <w:t>From then on, the volume contains that data independently.</w:t>
+        <w:t xml:space="preserve"> into the volume. From then on, the volume contains that data independently.</w:t>
       </w:r>
     </w:p>
     <w:p>
@@ -8679,6 +8566,7 @@
         </w:numPr>
         <w:spacing w:after="60"/>
         <w:ind w:left="360"/>
+        <w:jc w:val="both"/>
         <w:rPr>
           <w:rFonts w:asciiTheme="majorBidi" w:hAnsiTheme="majorBidi" w:cstheme="majorBidi"/>
           <w:b/>
@@ -8712,6 +8600,7 @@
       <w:pPr>
         <w:spacing w:after="0"/>
         <w:ind w:left="360"/>
+        <w:jc w:val="both"/>
         <w:rPr>
           <w:rFonts w:asciiTheme="majorBidi" w:hAnsiTheme="majorBidi" w:cstheme="majorBidi"/>
           <w:sz w:val="28"/>
@@ -8731,6 +8620,7 @@
       <w:pPr>
         <w:spacing w:after="0"/>
         <w:ind w:left="360"/>
+        <w:jc w:val="both"/>
         <w:rPr>
           <w:rFonts w:asciiTheme="majorBidi" w:hAnsiTheme="majorBidi" w:cstheme="majorBidi"/>
           <w:b/>
@@ -8758,6 +8648,7 @@
       <w:pPr>
         <w:spacing w:after="0"/>
         <w:ind w:left="360"/>
+        <w:jc w:val="both"/>
         <w:rPr>
           <w:rFonts w:asciiTheme="majorBidi" w:hAnsiTheme="majorBidi" w:cstheme="majorBidi"/>
           <w:sz w:val="28"/>
@@ -8777,6 +8668,7 @@
       <w:pPr>
         <w:spacing w:after="0"/>
         <w:ind w:left="360"/>
+        <w:jc w:val="both"/>
         <w:rPr>
           <w:rFonts w:asciiTheme="majorBidi" w:hAnsiTheme="majorBidi" w:cstheme="majorBidi"/>
           <w:b/>
@@ -8860,6 +8752,7 @@
       <w:pPr>
         <w:spacing w:after="0"/>
         <w:ind w:left="360"/>
+        <w:jc w:val="both"/>
         <w:rPr>
           <w:rFonts w:asciiTheme="majorBidi" w:hAnsiTheme="majorBidi" w:cstheme="majorBidi"/>
           <w:sz w:val="28"/>
@@ -8879,6 +8772,7 @@
       <w:pPr>
         <w:spacing w:after="0"/>
         <w:ind w:left="360"/>
+        <w:jc w:val="both"/>
         <w:rPr>
           <w:rFonts w:asciiTheme="majorBidi" w:hAnsiTheme="majorBidi" w:cstheme="majorBidi"/>
           <w:sz w:val="28"/>
@@ -8903,6 +8797,7 @@
         </w:numPr>
         <w:spacing w:after="0"/>
         <w:ind w:left="720"/>
+        <w:jc w:val="both"/>
         <w:rPr>
           <w:rFonts w:asciiTheme="majorBidi" w:hAnsiTheme="majorBidi" w:cstheme="majorBidi"/>
           <w:sz w:val="28"/>
@@ -8927,6 +8822,7 @@
         </w:numPr>
         <w:spacing w:after="0"/>
         <w:ind w:left="720"/>
+        <w:jc w:val="both"/>
         <w:rPr>
           <w:rFonts w:asciiTheme="majorBidi" w:hAnsiTheme="majorBidi" w:cstheme="majorBidi"/>
           <w:sz w:val="28"/>
@@ -8951,6 +8847,7 @@
         </w:numPr>
         <w:spacing w:after="0"/>
         <w:ind w:left="720"/>
+        <w:jc w:val="both"/>
         <w:rPr>
           <w:rFonts w:asciiTheme="majorBidi" w:hAnsiTheme="majorBidi" w:cstheme="majorBidi"/>
           <w:sz w:val="28"/>
@@ -8969,6 +8866,7 @@
     <w:p>
       <w:pPr>
         <w:ind w:left="360"/>
+        <w:jc w:val="both"/>
         <w:rPr>
           <w:rFonts w:asciiTheme="majorBidi" w:hAnsiTheme="majorBidi" w:cstheme="majorBidi"/>
           <w:sz w:val="28"/>
@@ -8982,6 +8880,875 @@
           <w:szCs w:val="28"/>
         </w:rPr>
         <w:t>Volumes are safer and more abstract.</w:t>
+      </w:r>
+    </w:p>
+    <w:p>
+      <w:pPr>
+        <w:pStyle w:val="ListParagraph"/>
+        <w:numPr>
+          <w:ilvl w:val="0"/>
+          <w:numId w:val="36"/>
+        </w:numPr>
+        <w:spacing w:after="60"/>
+        <w:ind w:left="360"/>
+        <w:jc w:val="both"/>
+        <w:rPr>
+          <w:rFonts w:asciiTheme="majorBidi" w:hAnsiTheme="majorBidi" w:cstheme="majorBidi"/>
+          <w:b/>
+          <w:bCs/>
+          <w:sz w:val="32"/>
+          <w:szCs w:val="32"/>
+        </w:rPr>
+      </w:pPr>
+      <w:proofErr w:type="spellStart"/>
+      <w:r>
+        <w:rPr>
+          <w:rFonts w:asciiTheme="majorBidi" w:hAnsiTheme="majorBidi" w:cstheme="majorBidi"/>
+          <w:b/>
+          <w:bCs/>
+          <w:sz w:val="32"/>
+          <w:szCs w:val="32"/>
+        </w:rPr>
+        <w:t>tmpfs</w:t>
+      </w:r>
+      <w:proofErr w:type="spellEnd"/>
+      <w:r>
+        <w:rPr>
+          <w:rFonts w:asciiTheme="majorBidi" w:hAnsiTheme="majorBidi" w:cstheme="majorBidi"/>
+          <w:b/>
+          <w:bCs/>
+          <w:sz w:val="32"/>
+          <w:szCs w:val="32"/>
+        </w:rPr>
+        <w:t>:</w:t>
+      </w:r>
+    </w:p>
+    <w:p>
+      <w:pPr>
+        <w:spacing w:after="0"/>
+        <w:ind w:left="360"/>
+        <w:jc w:val="both"/>
+        <w:rPr>
+          <w:rFonts w:asciiTheme="majorBidi" w:hAnsiTheme="majorBidi" w:cstheme="majorBidi"/>
+          <w:sz w:val="28"/>
+          <w:szCs w:val="28"/>
+        </w:rPr>
+      </w:pPr>
+      <w:proofErr w:type="spellStart"/>
+      <w:r>
+        <w:rPr>
+          <w:rFonts w:asciiTheme="majorBidi" w:hAnsiTheme="majorBidi" w:cstheme="majorBidi"/>
+          <w:sz w:val="28"/>
+          <w:szCs w:val="28"/>
+        </w:rPr>
+        <w:t>tmpfs</w:t>
+      </w:r>
+      <w:proofErr w:type="spellEnd"/>
+      <w:r>
+        <w:rPr>
+          <w:rFonts w:asciiTheme="majorBidi" w:hAnsiTheme="majorBidi" w:cstheme="majorBidi"/>
+          <w:sz w:val="28"/>
+          <w:szCs w:val="28"/>
+        </w:rPr>
+        <w:t xml:space="preserve"> is a mount type that stores data in RAM, not on disk.</w:t>
+      </w:r>
+    </w:p>
+    <w:p>
+      <w:pPr>
+        <w:spacing w:after="0"/>
+        <w:ind w:left="360"/>
+        <w:jc w:val="both"/>
+        <w:rPr>
+          <w:rFonts w:asciiTheme="majorBidi" w:hAnsiTheme="majorBidi" w:cstheme="majorBidi"/>
+          <w:sz w:val="28"/>
+          <w:szCs w:val="28"/>
+        </w:rPr>
+      </w:pPr>
+      <w:r>
+        <w:rPr>
+          <w:rFonts w:asciiTheme="majorBidi" w:hAnsiTheme="majorBidi" w:cstheme="majorBidi"/>
+          <w:sz w:val="28"/>
+          <w:szCs w:val="28"/>
+        </w:rPr>
+        <w:t>When you run:</w:t>
+      </w:r>
+    </w:p>
+    <w:p>
+      <w:pPr>
+        <w:spacing w:after="0"/>
+        <w:ind w:left="360"/>
+        <w:jc w:val="both"/>
+        <w:rPr>
+          <w:rFonts w:asciiTheme="majorBidi" w:hAnsiTheme="majorBidi" w:cstheme="majorBidi"/>
+          <w:b/>
+          <w:bCs/>
+          <w:i/>
+          <w:iCs/>
+          <w:sz w:val="28"/>
+          <w:szCs w:val="28"/>
+        </w:rPr>
+      </w:pPr>
+      <w:r>
+        <w:rPr>
+          <w:rFonts w:asciiTheme="majorBidi" w:hAnsiTheme="majorBidi" w:cstheme="majorBidi"/>
+          <w:b/>
+          <w:bCs/>
+          <w:i/>
+          <w:iCs/>
+          <w:sz w:val="28"/>
+          <w:szCs w:val="28"/>
+        </w:rPr>
+        <w:t>docker run --</w:t>
+      </w:r>
+      <w:proofErr w:type="spellStart"/>
+      <w:r>
+        <w:rPr>
+          <w:rFonts w:asciiTheme="majorBidi" w:hAnsiTheme="majorBidi" w:cstheme="majorBidi"/>
+          <w:b/>
+          <w:bCs/>
+          <w:i/>
+          <w:iCs/>
+          <w:sz w:val="28"/>
+          <w:szCs w:val="28"/>
+        </w:rPr>
+        <w:t>tmpfs</w:t>
+      </w:r>
+      <w:proofErr w:type="spellEnd"/>
+      <w:r>
+        <w:rPr>
+          <w:rFonts w:asciiTheme="majorBidi" w:hAnsiTheme="majorBidi" w:cstheme="majorBidi"/>
+          <w:b/>
+          <w:bCs/>
+          <w:i/>
+          <w:iCs/>
+          <w:sz w:val="28"/>
+          <w:szCs w:val="28"/>
+        </w:rPr>
+        <w:t xml:space="preserve"> /app/cache nginx</w:t>
+      </w:r>
+      <w:r>
+        <w:rPr>
+          <w:rFonts w:asciiTheme="majorBidi" w:hAnsiTheme="majorBidi" w:cstheme="majorBidi"/>
+          <w:b/>
+          <w:bCs/>
+          <w:i/>
+          <w:iCs/>
+          <w:sz w:val="28"/>
+          <w:szCs w:val="28"/>
+        </w:rPr>
+        <w:t xml:space="preserve"> </w:t>
+      </w:r>
+      <w:r>
+        <w:rPr>
+          <w:rFonts w:asciiTheme="majorBidi" w:hAnsiTheme="majorBidi" w:cstheme="majorBidi"/>
+          <w:sz w:val="28"/>
+          <w:szCs w:val="28"/>
+        </w:rPr>
+        <w:t>→</w:t>
+      </w:r>
+      <w:r>
+        <w:rPr>
+          <w:rFonts w:asciiTheme="majorBidi" w:hAnsiTheme="majorBidi" w:cstheme="majorBidi"/>
+          <w:sz w:val="28"/>
+          <w:szCs w:val="28"/>
+        </w:rPr>
+        <w:t xml:space="preserve"> </w:t>
+      </w:r>
+      <w:r>
+        <w:rPr>
+          <w:rFonts w:asciiTheme="majorBidi" w:hAnsiTheme="majorBidi" w:cstheme="majorBidi"/>
+          <w:sz w:val="28"/>
+          <w:szCs w:val="28"/>
+        </w:rPr>
+        <w:t xml:space="preserve">Docker creates a </w:t>
+      </w:r>
+      <w:proofErr w:type="spellStart"/>
+      <w:r>
+        <w:rPr>
+          <w:rFonts w:asciiTheme="majorBidi" w:hAnsiTheme="majorBidi" w:cstheme="majorBidi"/>
+          <w:sz w:val="28"/>
+          <w:szCs w:val="28"/>
+        </w:rPr>
+        <w:t>tmpfs</w:t>
+      </w:r>
+      <w:proofErr w:type="spellEnd"/>
+      <w:r>
+        <w:rPr>
+          <w:rFonts w:asciiTheme="majorBidi" w:hAnsiTheme="majorBidi" w:cstheme="majorBidi"/>
+          <w:sz w:val="28"/>
+          <w:szCs w:val="28"/>
+        </w:rPr>
+        <w:t xml:space="preserve"> mount at </w:t>
+      </w:r>
+      <w:r>
+        <w:rPr>
+          <w:rFonts w:asciiTheme="majorBidi" w:hAnsiTheme="majorBidi" w:cstheme="majorBidi"/>
+          <w:b/>
+          <w:bCs/>
+          <w:i/>
+          <w:iCs/>
+          <w:sz w:val="28"/>
+          <w:szCs w:val="28"/>
+        </w:rPr>
+        <w:t>/app/cache</w:t>
+      </w:r>
+      <w:r>
+        <w:rPr>
+          <w:rFonts w:asciiTheme="majorBidi" w:hAnsiTheme="majorBidi" w:cstheme="majorBidi"/>
+          <w:sz w:val="28"/>
+          <w:szCs w:val="28"/>
+        </w:rPr>
+        <w:t xml:space="preserve"> inside the container. That directory lives in memory. Not in </w:t>
+      </w:r>
+      <w:r>
+        <w:rPr>
+          <w:rFonts w:asciiTheme="majorBidi" w:hAnsiTheme="majorBidi" w:cstheme="majorBidi"/>
+          <w:b/>
+          <w:bCs/>
+          <w:i/>
+          <w:iCs/>
+          <w:sz w:val="28"/>
+          <w:szCs w:val="28"/>
+        </w:rPr>
+        <w:t>/var/lib/docker</w:t>
+      </w:r>
+      <w:r>
+        <w:rPr>
+          <w:rFonts w:asciiTheme="majorBidi" w:hAnsiTheme="majorBidi" w:cstheme="majorBidi"/>
+          <w:sz w:val="28"/>
+          <w:szCs w:val="28"/>
+        </w:rPr>
+        <w:t>. Not in overlay2. Not in volumes. In RAM.</w:t>
+      </w:r>
+      <w:r>
+        <w:rPr>
+          <w:rFonts w:asciiTheme="majorBidi" w:hAnsiTheme="majorBidi" w:cstheme="majorBidi"/>
+          <w:sz w:val="28"/>
+          <w:szCs w:val="28"/>
+        </w:rPr>
+        <w:t xml:space="preserve"> Because of that,</w:t>
+      </w:r>
+      <w:r>
+        <w:rPr>
+          <w:rFonts w:asciiTheme="majorBidi" w:hAnsiTheme="majorBidi" w:cstheme="majorBidi"/>
+          <w:b/>
+          <w:bCs/>
+          <w:i/>
+          <w:iCs/>
+          <w:sz w:val="28"/>
+          <w:szCs w:val="28"/>
+        </w:rPr>
+        <w:t xml:space="preserve"> </w:t>
+      </w:r>
+      <w:r>
+        <w:rPr>
+          <w:rFonts w:asciiTheme="majorBidi" w:hAnsiTheme="majorBidi" w:cstheme="majorBidi"/>
+          <w:sz w:val="28"/>
+          <w:szCs w:val="28"/>
+        </w:rPr>
+        <w:t>w</w:t>
+      </w:r>
+      <w:r>
+        <w:rPr>
+          <w:rFonts w:asciiTheme="majorBidi" w:hAnsiTheme="majorBidi" w:cstheme="majorBidi"/>
+          <w:sz w:val="28"/>
+          <w:szCs w:val="28"/>
+        </w:rPr>
+        <w:t>hen the container stops, the data is gone. Completely. No persistence. No trace.</w:t>
+      </w:r>
+    </w:p>
+    <w:p>
+      <w:pPr>
+        <w:spacing w:after="0"/>
+        <w:ind w:left="360"/>
+        <w:jc w:val="both"/>
+        <w:rPr>
+          <w:rFonts w:asciiTheme="majorBidi" w:hAnsiTheme="majorBidi" w:cstheme="majorBidi"/>
+          <w:sz w:val="28"/>
+          <w:szCs w:val="28"/>
+        </w:rPr>
+      </w:pPr>
+      <w:r>
+        <w:rPr>
+          <w:rFonts w:asciiTheme="majorBidi" w:hAnsiTheme="majorBidi" w:cstheme="majorBidi"/>
+          <w:sz w:val="28"/>
+          <w:szCs w:val="28"/>
+        </w:rPr>
+        <w:t xml:space="preserve">This is not a Docker invention either. </w:t>
+      </w:r>
+      <w:proofErr w:type="spellStart"/>
+      <w:r>
+        <w:rPr>
+          <w:rFonts w:asciiTheme="majorBidi" w:hAnsiTheme="majorBidi" w:cstheme="majorBidi"/>
+          <w:sz w:val="28"/>
+          <w:szCs w:val="28"/>
+        </w:rPr>
+        <w:t>tmpfs</w:t>
+      </w:r>
+      <w:proofErr w:type="spellEnd"/>
+      <w:r>
+        <w:rPr>
+          <w:rFonts w:asciiTheme="majorBidi" w:hAnsiTheme="majorBidi" w:cstheme="majorBidi"/>
+          <w:sz w:val="28"/>
+          <w:szCs w:val="28"/>
+        </w:rPr>
+        <w:t xml:space="preserve"> is a native Linux filesystem type designed for temporary storage backed by memory (and possibly swap). Docker is just exposing it</w:t>
+      </w:r>
+      <w:r>
+        <w:rPr>
+          <w:rFonts w:asciiTheme="majorBidi" w:hAnsiTheme="majorBidi" w:cstheme="majorBidi"/>
+          <w:sz w:val="28"/>
+          <w:szCs w:val="28"/>
+        </w:rPr>
+        <w:t>.</w:t>
+      </w:r>
+    </w:p>
+    <w:p>
+      <w:pPr>
+        <w:spacing w:after="0"/>
+        <w:ind w:left="360"/>
+        <w:jc w:val="both"/>
+        <w:rPr>
+          <w:rFonts w:asciiTheme="majorBidi" w:hAnsiTheme="majorBidi" w:cstheme="majorBidi"/>
+          <w:sz w:val="28"/>
+          <w:szCs w:val="28"/>
+        </w:rPr>
+      </w:pPr>
+      <w:r>
+        <w:rPr>
+          <w:rFonts w:asciiTheme="majorBidi" w:hAnsiTheme="majorBidi" w:cstheme="majorBidi"/>
+          <w:sz w:val="28"/>
+          <w:szCs w:val="28"/>
+        </w:rPr>
+        <w:t>I</w:t>
+      </w:r>
+      <w:r>
+        <w:rPr>
+          <w:rFonts w:asciiTheme="majorBidi" w:hAnsiTheme="majorBidi" w:cstheme="majorBidi"/>
+          <w:sz w:val="28"/>
+          <w:szCs w:val="28"/>
+        </w:rPr>
+        <w:t>t is</w:t>
+      </w:r>
+      <w:r>
+        <w:rPr>
+          <w:rFonts w:asciiTheme="majorBidi" w:hAnsiTheme="majorBidi" w:cstheme="majorBidi"/>
+          <w:sz w:val="28"/>
+          <w:szCs w:val="28"/>
+        </w:rPr>
+        <w:t>n</w:t>
+      </w:r>
+      <w:r>
+        <w:rPr>
+          <w:rFonts w:asciiTheme="majorBidi" w:hAnsiTheme="majorBidi" w:cstheme="majorBidi"/>
+          <w:sz w:val="28"/>
+          <w:szCs w:val="28"/>
+        </w:rPr>
+        <w:t>’</w:t>
+      </w:r>
+      <w:r>
+        <w:rPr>
+          <w:rFonts w:asciiTheme="majorBidi" w:hAnsiTheme="majorBidi" w:cstheme="majorBidi"/>
+          <w:sz w:val="28"/>
+          <w:szCs w:val="28"/>
+        </w:rPr>
+        <w:t>t</w:t>
+      </w:r>
+      <w:r>
+        <w:rPr>
+          <w:rFonts w:asciiTheme="majorBidi" w:hAnsiTheme="majorBidi" w:cstheme="majorBidi"/>
+          <w:sz w:val="28"/>
+          <w:szCs w:val="28"/>
+        </w:rPr>
+        <w:t xml:space="preserve"> stored</w:t>
+      </w:r>
+      <w:r>
+        <w:rPr>
+          <w:rFonts w:asciiTheme="majorBidi" w:hAnsiTheme="majorBidi" w:cstheme="majorBidi"/>
+          <w:sz w:val="28"/>
+          <w:szCs w:val="28"/>
+        </w:rPr>
+        <w:t xml:space="preserve"> </w:t>
+      </w:r>
+      <w:r>
+        <w:rPr>
+          <w:rFonts w:asciiTheme="majorBidi" w:hAnsiTheme="majorBidi" w:cstheme="majorBidi"/>
+          <w:sz w:val="28"/>
+          <w:szCs w:val="28"/>
+        </w:rPr>
+        <w:t xml:space="preserve">under </w:t>
+      </w:r>
+      <w:r>
+        <w:rPr>
+          <w:rFonts w:asciiTheme="majorBidi" w:hAnsiTheme="majorBidi" w:cstheme="majorBidi"/>
+          <w:b/>
+          <w:bCs/>
+          <w:i/>
+          <w:iCs/>
+          <w:sz w:val="28"/>
+          <w:szCs w:val="28"/>
+        </w:rPr>
+        <w:t>/var/lib/docker/volumes/</w:t>
+      </w:r>
+      <w:r>
+        <w:rPr>
+          <w:rFonts w:asciiTheme="majorBidi" w:hAnsiTheme="majorBidi" w:cstheme="majorBidi"/>
+          <w:sz w:val="28"/>
+          <w:szCs w:val="28"/>
+        </w:rPr>
+        <w:t xml:space="preserve"> or </w:t>
+      </w:r>
+      <w:r>
+        <w:rPr>
+          <w:rFonts w:asciiTheme="majorBidi" w:hAnsiTheme="majorBidi" w:cstheme="majorBidi"/>
+          <w:b/>
+          <w:bCs/>
+          <w:i/>
+          <w:iCs/>
+          <w:sz w:val="28"/>
+          <w:szCs w:val="28"/>
+        </w:rPr>
+        <w:t>/var/lib/docker/overlay2/</w:t>
+      </w:r>
+      <w:r>
+        <w:rPr>
+          <w:rFonts w:asciiTheme="majorBidi" w:hAnsiTheme="majorBidi" w:cstheme="majorBidi"/>
+          <w:sz w:val="28"/>
+          <w:szCs w:val="28"/>
+        </w:rPr>
+        <w:t>.</w:t>
+      </w:r>
+      <w:r>
+        <w:rPr>
+          <w:rFonts w:asciiTheme="majorBidi" w:hAnsiTheme="majorBidi" w:cstheme="majorBidi"/>
+          <w:sz w:val="28"/>
+          <w:szCs w:val="28"/>
+        </w:rPr>
+        <w:t xml:space="preserve"> </w:t>
+      </w:r>
+      <w:r>
+        <w:rPr>
+          <w:rFonts w:asciiTheme="majorBidi" w:hAnsiTheme="majorBidi" w:cstheme="majorBidi"/>
+          <w:sz w:val="28"/>
+          <w:szCs w:val="28"/>
+        </w:rPr>
+        <w:t>It is mounted from the host kernel’s memory subsystem into the container’s mount namespace.</w:t>
+      </w:r>
+      <w:r>
+        <w:rPr>
+          <w:rFonts w:asciiTheme="majorBidi" w:hAnsiTheme="majorBidi" w:cstheme="majorBidi"/>
+          <w:sz w:val="28"/>
+          <w:szCs w:val="28"/>
+        </w:rPr>
+        <w:t xml:space="preserve"> </w:t>
+      </w:r>
+      <w:r>
+        <w:rPr>
+          <w:rFonts w:asciiTheme="majorBidi" w:hAnsiTheme="majorBidi" w:cstheme="majorBidi"/>
+          <w:sz w:val="28"/>
+          <w:szCs w:val="28"/>
+        </w:rPr>
+        <w:t>There is no directory on disk representing it.</w:t>
+      </w:r>
+    </w:p>
+    <w:p>
+      <w:pPr>
+        <w:spacing w:after="0"/>
+        <w:ind w:left="360"/>
+        <w:jc w:val="both"/>
+        <w:rPr>
+          <w:rFonts w:asciiTheme="majorBidi" w:hAnsiTheme="majorBidi" w:cstheme="majorBidi"/>
+          <w:sz w:val="28"/>
+          <w:szCs w:val="28"/>
+        </w:rPr>
+      </w:pPr>
+      <w:r>
+        <w:rPr>
+          <w:rFonts w:asciiTheme="majorBidi" w:hAnsiTheme="majorBidi" w:cstheme="majorBidi"/>
+          <w:sz w:val="28"/>
+          <w:szCs w:val="28"/>
+        </w:rPr>
+        <w:t>Since it lives in RAM:</w:t>
+      </w:r>
+    </w:p>
+    <w:p>
+      <w:pPr>
+        <w:pStyle w:val="ListParagraph"/>
+        <w:numPr>
+          <w:ilvl w:val="1"/>
+          <w:numId w:val="36"/>
+        </w:numPr>
+        <w:ind w:left="720"/>
+        <w:jc w:val="both"/>
+        <w:rPr>
+          <w:rFonts w:asciiTheme="majorBidi" w:hAnsiTheme="majorBidi" w:cstheme="majorBidi"/>
+          <w:sz w:val="28"/>
+          <w:szCs w:val="28"/>
+        </w:rPr>
+      </w:pPr>
+      <w:r>
+        <w:rPr>
+          <w:rFonts w:asciiTheme="majorBidi" w:hAnsiTheme="majorBidi" w:cstheme="majorBidi"/>
+          <w:sz w:val="28"/>
+          <w:szCs w:val="28"/>
+        </w:rPr>
+        <w:t>Extremely fast reads and writes.</w:t>
+      </w:r>
+    </w:p>
+    <w:p>
+      <w:pPr>
+        <w:pStyle w:val="ListParagraph"/>
+        <w:numPr>
+          <w:ilvl w:val="1"/>
+          <w:numId w:val="36"/>
+        </w:numPr>
+        <w:ind w:left="720"/>
+        <w:jc w:val="both"/>
+        <w:rPr>
+          <w:rFonts w:asciiTheme="majorBidi" w:hAnsiTheme="majorBidi" w:cstheme="majorBidi"/>
+          <w:sz w:val="28"/>
+          <w:szCs w:val="28"/>
+        </w:rPr>
+      </w:pPr>
+      <w:r>
+        <w:rPr>
+          <w:rFonts w:asciiTheme="majorBidi" w:hAnsiTheme="majorBidi" w:cstheme="majorBidi"/>
+          <w:sz w:val="28"/>
+          <w:szCs w:val="28"/>
+        </w:rPr>
+        <w:t>No disk I/O.</w:t>
+      </w:r>
+    </w:p>
+    <w:p>
+      <w:pPr>
+        <w:pStyle w:val="ListParagraph"/>
+        <w:numPr>
+          <w:ilvl w:val="1"/>
+          <w:numId w:val="36"/>
+        </w:numPr>
+        <w:spacing w:after="0"/>
+        <w:ind w:left="720"/>
+        <w:jc w:val="both"/>
+        <w:rPr>
+          <w:rFonts w:asciiTheme="majorBidi" w:hAnsiTheme="majorBidi" w:cstheme="majorBidi"/>
+          <w:sz w:val="28"/>
+          <w:szCs w:val="28"/>
+        </w:rPr>
+      </w:pPr>
+      <w:r>
+        <w:rPr>
+          <w:rFonts w:asciiTheme="majorBidi" w:hAnsiTheme="majorBidi" w:cstheme="majorBidi"/>
+          <w:sz w:val="28"/>
+          <w:szCs w:val="28"/>
+        </w:rPr>
+        <w:t>Ideal for temporary cache, session data, intermediate computation.</w:t>
+      </w:r>
+    </w:p>
+    <w:p>
+      <w:pPr>
+        <w:ind w:left="360"/>
+        <w:jc w:val="both"/>
+        <w:rPr>
+          <w:rFonts w:asciiTheme="majorBidi" w:hAnsiTheme="majorBidi" w:cstheme="majorBidi"/>
+          <w:sz w:val="28"/>
+          <w:szCs w:val="28"/>
+        </w:rPr>
+      </w:pPr>
+      <w:r>
+        <w:rPr>
+          <w:rFonts w:asciiTheme="majorBidi" w:hAnsiTheme="majorBidi" w:cstheme="majorBidi"/>
+          <w:sz w:val="28"/>
+          <w:szCs w:val="28"/>
+        </w:rPr>
+        <w:t>But it consumes host memory.</w:t>
+      </w:r>
+    </w:p>
+    <w:p>
+      <w:pPr>
+        <w:spacing w:after="0"/>
+        <w:ind w:left="360"/>
+        <w:jc w:val="both"/>
+        <w:rPr>
+          <w:rFonts w:asciiTheme="majorBidi" w:hAnsiTheme="majorBidi" w:cstheme="majorBidi"/>
+          <w:sz w:val="28"/>
+          <w:szCs w:val="28"/>
+        </w:rPr>
+      </w:pPr>
+      <w:r>
+        <w:rPr>
+          <w:rFonts w:asciiTheme="majorBidi" w:hAnsiTheme="majorBidi" w:cstheme="majorBidi"/>
+          <w:sz w:val="28"/>
+          <w:szCs w:val="28"/>
+        </w:rPr>
+        <w:lastRenderedPageBreak/>
+        <w:t>You can limit size:</w:t>
+      </w:r>
+    </w:p>
+    <w:p>
+      <w:pPr>
+        <w:spacing w:after="0"/>
+        <w:ind w:left="360"/>
+        <w:jc w:val="both"/>
+        <w:rPr>
+          <w:rFonts w:asciiTheme="majorBidi" w:hAnsiTheme="majorBidi" w:cstheme="majorBidi"/>
+          <w:b/>
+          <w:bCs/>
+          <w:i/>
+          <w:iCs/>
+          <w:sz w:val="28"/>
+          <w:szCs w:val="28"/>
+        </w:rPr>
+      </w:pPr>
+      <w:r>
+        <w:rPr>
+          <w:rFonts w:asciiTheme="majorBidi" w:hAnsiTheme="majorBidi" w:cstheme="majorBidi"/>
+          <w:b/>
+          <w:bCs/>
+          <w:i/>
+          <w:iCs/>
+          <w:sz w:val="28"/>
+          <w:szCs w:val="28"/>
+        </w:rPr>
+        <w:t>docker run --</w:t>
+      </w:r>
+      <w:proofErr w:type="spellStart"/>
+      <w:r>
+        <w:rPr>
+          <w:rFonts w:asciiTheme="majorBidi" w:hAnsiTheme="majorBidi" w:cstheme="majorBidi"/>
+          <w:b/>
+          <w:bCs/>
+          <w:i/>
+          <w:iCs/>
+          <w:sz w:val="28"/>
+          <w:szCs w:val="28"/>
+        </w:rPr>
+        <w:t>tmpfs</w:t>
+      </w:r>
+      <w:proofErr w:type="spellEnd"/>
+      <w:r>
+        <w:rPr>
+          <w:rFonts w:asciiTheme="majorBidi" w:hAnsiTheme="majorBidi" w:cstheme="majorBidi"/>
+          <w:b/>
+          <w:bCs/>
+          <w:i/>
+          <w:iCs/>
+          <w:sz w:val="28"/>
+          <w:szCs w:val="28"/>
+        </w:rPr>
+        <w:t xml:space="preserve"> /app/</w:t>
+      </w:r>
+      <w:proofErr w:type="spellStart"/>
+      <w:r>
+        <w:rPr>
+          <w:rFonts w:asciiTheme="majorBidi" w:hAnsiTheme="majorBidi" w:cstheme="majorBidi"/>
+          <w:b/>
+          <w:bCs/>
+          <w:i/>
+          <w:iCs/>
+          <w:sz w:val="28"/>
+          <w:szCs w:val="28"/>
+        </w:rPr>
+        <w:t>cache:</w:t>
+      </w:r>
+      <w:proofErr w:type="gramStart"/>
+      <w:r>
+        <w:rPr>
+          <w:rFonts w:asciiTheme="majorBidi" w:hAnsiTheme="majorBidi" w:cstheme="majorBidi"/>
+          <w:b/>
+          <w:bCs/>
+          <w:i/>
+          <w:iCs/>
+          <w:sz w:val="28"/>
+          <w:szCs w:val="28"/>
+        </w:rPr>
+        <w:t>rw,size</w:t>
+      </w:r>
+      <w:proofErr w:type="spellEnd"/>
+      <w:proofErr w:type="gramEnd"/>
+      <w:r>
+        <w:rPr>
+          <w:rFonts w:asciiTheme="majorBidi" w:hAnsiTheme="majorBidi" w:cstheme="majorBidi"/>
+          <w:b/>
+          <w:bCs/>
+          <w:i/>
+          <w:iCs/>
+          <w:sz w:val="28"/>
+          <w:szCs w:val="28"/>
+        </w:rPr>
+        <w:t>=100m nginx</w:t>
+      </w:r>
+      <w:r>
+        <w:rPr>
+          <w:rFonts w:asciiTheme="majorBidi" w:hAnsiTheme="majorBidi" w:cstheme="majorBidi"/>
+          <w:b/>
+          <w:bCs/>
+          <w:i/>
+          <w:iCs/>
+          <w:sz w:val="28"/>
+          <w:szCs w:val="28"/>
+        </w:rPr>
+        <w:t xml:space="preserve"> </w:t>
+      </w:r>
+      <w:r>
+        <w:rPr>
+          <w:rFonts w:asciiTheme="majorBidi" w:hAnsiTheme="majorBidi" w:cstheme="majorBidi"/>
+          <w:sz w:val="28"/>
+          <w:szCs w:val="28"/>
+        </w:rPr>
+        <w:t>→</w:t>
+      </w:r>
+      <w:r>
+        <w:rPr>
+          <w:rFonts w:asciiTheme="majorBidi" w:hAnsiTheme="majorBidi" w:cstheme="majorBidi"/>
+          <w:b/>
+          <w:bCs/>
+          <w:i/>
+          <w:iCs/>
+          <w:sz w:val="28"/>
+          <w:szCs w:val="28"/>
+        </w:rPr>
+        <w:t xml:space="preserve"> </w:t>
+      </w:r>
+      <w:r>
+        <w:rPr>
+          <w:rFonts w:asciiTheme="majorBidi" w:hAnsiTheme="majorBidi" w:cstheme="majorBidi"/>
+          <w:sz w:val="28"/>
+          <w:szCs w:val="28"/>
+        </w:rPr>
+        <w:t>Now it cannot grow beyond 100MB.</w:t>
+      </w:r>
+    </w:p>
+    <w:p>
+      <w:pPr>
+        <w:spacing w:after="0"/>
+        <w:ind w:left="360"/>
+        <w:jc w:val="both"/>
+        <w:rPr>
+          <w:rFonts w:asciiTheme="majorBidi" w:hAnsiTheme="majorBidi" w:cstheme="majorBidi"/>
+          <w:sz w:val="28"/>
+          <w:szCs w:val="28"/>
+        </w:rPr>
+      </w:pPr>
+      <w:r>
+        <w:rPr>
+          <w:rFonts w:asciiTheme="majorBidi" w:hAnsiTheme="majorBidi" w:cstheme="majorBidi"/>
+          <w:sz w:val="28"/>
+          <w:szCs w:val="28"/>
+        </w:rPr>
+        <w:t xml:space="preserve">Just like volumes and bind mounts, </w:t>
+      </w:r>
+      <w:proofErr w:type="spellStart"/>
+      <w:r>
+        <w:rPr>
+          <w:rFonts w:asciiTheme="majorBidi" w:hAnsiTheme="majorBidi" w:cstheme="majorBidi"/>
+          <w:sz w:val="28"/>
+          <w:szCs w:val="28"/>
+        </w:rPr>
+        <w:t>tmpfs</w:t>
+      </w:r>
+      <w:proofErr w:type="spellEnd"/>
+      <w:r>
+        <w:rPr>
+          <w:rFonts w:asciiTheme="majorBidi" w:hAnsiTheme="majorBidi" w:cstheme="majorBidi"/>
+          <w:sz w:val="28"/>
+          <w:szCs w:val="28"/>
+        </w:rPr>
+        <w:t xml:space="preserve"> overlays the directory.</w:t>
+      </w:r>
+      <w:r>
+        <w:rPr>
+          <w:rFonts w:asciiTheme="majorBidi" w:hAnsiTheme="majorBidi" w:cstheme="majorBidi"/>
+          <w:sz w:val="28"/>
+          <w:szCs w:val="28"/>
+        </w:rPr>
+        <w:t xml:space="preserve"> </w:t>
+      </w:r>
+      <w:r>
+        <w:rPr>
+          <w:rFonts w:asciiTheme="majorBidi" w:hAnsiTheme="majorBidi" w:cstheme="majorBidi"/>
+          <w:sz w:val="28"/>
+          <w:szCs w:val="28"/>
+        </w:rPr>
+        <w:t xml:space="preserve">If the image contains files in /app/cache, mounting </w:t>
+      </w:r>
+      <w:proofErr w:type="spellStart"/>
+      <w:r>
+        <w:rPr>
+          <w:rFonts w:asciiTheme="majorBidi" w:hAnsiTheme="majorBidi" w:cstheme="majorBidi"/>
+          <w:sz w:val="28"/>
+          <w:szCs w:val="28"/>
+        </w:rPr>
+        <w:t>tmpfs</w:t>
+      </w:r>
+      <w:proofErr w:type="spellEnd"/>
+      <w:r>
+        <w:rPr>
+          <w:rFonts w:asciiTheme="majorBidi" w:hAnsiTheme="majorBidi" w:cstheme="majorBidi"/>
+          <w:sz w:val="28"/>
+          <w:szCs w:val="28"/>
+        </w:rPr>
+        <w:t xml:space="preserve"> there hides them.</w:t>
+      </w:r>
+      <w:r>
+        <w:rPr>
+          <w:rFonts w:asciiTheme="majorBidi" w:hAnsiTheme="majorBidi" w:cstheme="majorBidi"/>
+          <w:sz w:val="28"/>
+          <w:szCs w:val="28"/>
+        </w:rPr>
+        <w:t xml:space="preserve"> </w:t>
+      </w:r>
+      <w:r>
+        <w:rPr>
+          <w:rFonts w:asciiTheme="majorBidi" w:hAnsiTheme="majorBidi" w:cstheme="majorBidi"/>
+          <w:sz w:val="28"/>
+          <w:szCs w:val="28"/>
+        </w:rPr>
+        <w:t>No automatic copying. It starts empty.</w:t>
+      </w:r>
+    </w:p>
+    <w:p>
+      <w:pPr>
+        <w:ind w:left="360"/>
+        <w:jc w:val="both"/>
+        <w:rPr>
+          <w:rFonts w:asciiTheme="majorBidi" w:hAnsiTheme="majorBidi" w:cstheme="majorBidi"/>
+          <w:sz w:val="28"/>
+          <w:szCs w:val="28"/>
+        </w:rPr>
+      </w:pPr>
+      <w:proofErr w:type="spellStart"/>
+      <w:r>
+        <w:rPr>
+          <w:rFonts w:asciiTheme="majorBidi" w:hAnsiTheme="majorBidi" w:cstheme="majorBidi"/>
+          <w:sz w:val="28"/>
+          <w:szCs w:val="28"/>
+        </w:rPr>
+        <w:t>tmpfs</w:t>
+      </w:r>
+      <w:proofErr w:type="spellEnd"/>
+      <w:r>
+        <w:rPr>
+          <w:rFonts w:asciiTheme="majorBidi" w:hAnsiTheme="majorBidi" w:cstheme="majorBidi"/>
+          <w:sz w:val="28"/>
+          <w:szCs w:val="28"/>
+        </w:rPr>
+        <w:t xml:space="preserve"> is especially valuable for sensitive data like secrets, temporary tokens, or cryptographic material</w:t>
+      </w:r>
+      <w:r>
+        <w:rPr>
+          <w:rFonts w:asciiTheme="majorBidi" w:hAnsiTheme="majorBidi" w:cstheme="majorBidi"/>
+          <w:sz w:val="28"/>
+          <w:szCs w:val="28"/>
+        </w:rPr>
+        <w:t>,</w:t>
+      </w:r>
+      <w:r>
+        <w:rPr>
+          <w:rFonts w:asciiTheme="majorBidi" w:hAnsiTheme="majorBidi" w:cstheme="majorBidi"/>
+          <w:sz w:val="28"/>
+          <w:szCs w:val="28"/>
+        </w:rPr>
+        <w:t xml:space="preserve"> because nothing touches disk. Even if someone snapshots the filesystem, it’s not there.</w:t>
       </w:r>
     </w:p>
     <w:p>
@@ -9149,23 +9916,7 @@
           <w:sz w:val="28"/>
           <w:szCs w:val="28"/>
         </w:rPr>
-        <w:t>List volumes</w:t>
-      </w:r>
-      <w:r>
-        <w:rPr>
-          <w:rFonts w:asciiTheme="majorBidi" w:hAnsiTheme="majorBidi" w:cstheme="majorBidi"/>
-          <w:sz w:val="28"/>
-          <w:szCs w:val="28"/>
-        </w:rPr>
-        <w:t xml:space="preserve"> </w:t>
-      </w:r>
-      <w:r>
-        <w:rPr>
-          <w:rFonts w:asciiTheme="majorBidi" w:hAnsiTheme="majorBidi" w:cstheme="majorBidi"/>
-          <w:sz w:val="28"/>
-          <w:szCs w:val="28"/>
-        </w:rPr>
-        <w:t xml:space="preserve">→ </w:t>
+        <w:t xml:space="preserve">List volumes → </w:t>
       </w:r>
       <w:r>
         <w:rPr>
@@ -9200,23 +9951,7 @@
           <w:sz w:val="28"/>
           <w:szCs w:val="28"/>
         </w:rPr>
-        <w:t>Inspect a volume</w:t>
-      </w:r>
-      <w:r>
-        <w:rPr>
-          <w:rFonts w:asciiTheme="majorBidi" w:hAnsiTheme="majorBidi" w:cstheme="majorBidi"/>
-          <w:sz w:val="28"/>
-          <w:szCs w:val="28"/>
-        </w:rPr>
-        <w:t xml:space="preserve"> </w:t>
-      </w:r>
-      <w:r>
-        <w:rPr>
-          <w:rFonts w:asciiTheme="majorBidi" w:hAnsiTheme="majorBidi" w:cstheme="majorBidi"/>
-          <w:sz w:val="28"/>
-          <w:szCs w:val="28"/>
-        </w:rPr>
-        <w:t xml:space="preserve">→ </w:t>
+        <w:t xml:space="preserve">Inspect a volume → </w:t>
       </w:r>
       <w:r>
         <w:rPr>
@@ -9265,23 +10000,7 @@
           <w:sz w:val="28"/>
           <w:szCs w:val="28"/>
         </w:rPr>
-        <w:t>Remove a volume</w:t>
-      </w:r>
-      <w:r>
-        <w:rPr>
-          <w:rFonts w:asciiTheme="majorBidi" w:hAnsiTheme="majorBidi" w:cstheme="majorBidi"/>
-          <w:sz w:val="28"/>
-          <w:szCs w:val="28"/>
-        </w:rPr>
-        <w:t xml:space="preserve"> </w:t>
-      </w:r>
-      <w:r>
-        <w:rPr>
-          <w:rFonts w:asciiTheme="majorBidi" w:hAnsiTheme="majorBidi" w:cstheme="majorBidi"/>
-          <w:sz w:val="28"/>
-          <w:szCs w:val="28"/>
-        </w:rPr>
-        <w:t xml:space="preserve">→ </w:t>
+        <w:t xml:space="preserve">Remove a volume → </w:t>
       </w:r>
       <w:r>
         <w:rPr>
@@ -9330,23 +10049,7 @@
           <w:sz w:val="28"/>
           <w:szCs w:val="28"/>
         </w:rPr>
-        <w:t>Remove unused volumes</w:t>
-      </w:r>
-      <w:r>
-        <w:rPr>
-          <w:rFonts w:asciiTheme="majorBidi" w:hAnsiTheme="majorBidi" w:cstheme="majorBidi"/>
-          <w:sz w:val="28"/>
-          <w:szCs w:val="28"/>
-        </w:rPr>
-        <w:t xml:space="preserve"> </w:t>
-      </w:r>
-      <w:r>
-        <w:rPr>
-          <w:rFonts w:asciiTheme="majorBidi" w:hAnsiTheme="majorBidi" w:cstheme="majorBidi"/>
-          <w:sz w:val="28"/>
-          <w:szCs w:val="28"/>
-        </w:rPr>
-        <w:t xml:space="preserve">→ </w:t>
+        <w:t xml:space="preserve">Remove unused volumes → </w:t>
       </w:r>
       <w:r>
         <w:rPr>
@@ -9380,17 +10083,7 @@
           <w:sz w:val="28"/>
           <w:szCs w:val="28"/>
         </w:rPr>
-        <w:t>mount syntax</w:t>
-      </w:r>
-      <w:r>
-        <w:rPr>
-          <w:rFonts w:asciiTheme="majorBidi" w:hAnsiTheme="majorBidi" w:cstheme="majorBidi"/>
-          <w:b/>
-          <w:bCs/>
-          <w:sz w:val="28"/>
-          <w:szCs w:val="28"/>
-        </w:rPr>
-        <w:t>:</w:t>
+        <w:t>mount syntax:</w:t>
       </w:r>
     </w:p>
     <w:p>
@@ -9413,23 +10106,7 @@
           <w:sz w:val="28"/>
           <w:szCs w:val="28"/>
         </w:rPr>
-        <w:t>Old syntax</w:t>
-      </w:r>
-      <w:r>
-        <w:rPr>
-          <w:rFonts w:asciiTheme="majorBidi" w:hAnsiTheme="majorBidi" w:cstheme="majorBidi"/>
-          <w:sz w:val="28"/>
-          <w:szCs w:val="28"/>
-        </w:rPr>
-        <w:t xml:space="preserve"> </w:t>
-      </w:r>
-      <w:r>
-        <w:rPr>
-          <w:rFonts w:asciiTheme="majorBidi" w:hAnsiTheme="majorBidi" w:cstheme="majorBidi"/>
-          <w:sz w:val="28"/>
-          <w:szCs w:val="28"/>
-        </w:rPr>
-        <w:t xml:space="preserve">→ </w:t>
+        <w:t xml:space="preserve">Old syntax → </w:t>
       </w:r>
       <w:r>
         <w:rPr>
@@ -9492,23 +10169,7 @@
           <w:sz w:val="28"/>
           <w:szCs w:val="28"/>
         </w:rPr>
-        <w:t>New syntax (recommended)</w:t>
-      </w:r>
-      <w:r>
-        <w:rPr>
-          <w:rFonts w:asciiTheme="majorBidi" w:hAnsiTheme="majorBidi" w:cstheme="majorBidi"/>
-          <w:sz w:val="28"/>
-          <w:szCs w:val="28"/>
-        </w:rPr>
-        <w:t xml:space="preserve"> </w:t>
-      </w:r>
-      <w:r>
-        <w:rPr>
-          <w:rFonts w:asciiTheme="majorBidi" w:hAnsiTheme="majorBidi" w:cstheme="majorBidi"/>
-          <w:sz w:val="28"/>
-          <w:szCs w:val="28"/>
-        </w:rPr>
-        <w:t xml:space="preserve">→ </w:t>
+        <w:t xml:space="preserve">New syntax (recommended) → </w:t>
       </w:r>
       <w:r>
         <w:rPr>
@@ -9624,7 +10285,6 @@
           <w:sz w:val="28"/>
           <w:szCs w:val="28"/>
         </w:rPr>
-        <w:lastRenderedPageBreak/>
         <w:t>ro</w:t>
       </w:r>
       <w:proofErr w:type="spellEnd"/>
@@ -11789,7 +12449,7 @@
   <w:abstractNum w:abstractNumId="18" w15:restartNumberingAfterBreak="0">
     <w:nsid w:val="3FAB32CB"/>
     <w:multiLevelType w:val="hybridMultilevel"/>
-    <w:tmpl w:val="0EFC3818"/>
+    <w:tmpl w:val="FC502026"/>
     <w:lvl w:ilvl="0" w:tplc="04090001">
       <w:start w:val="1"/>
       <w:numFmt w:val="bullet"/>

</xml_diff>